<commit_message>
Add Independent freelance stint (Feb-May 2022), close employment gap
Single-line education entries with right-tab dates to keep the resume
at exactly one page. PDF now rendered via Word (LibreOffice was
uninstalled during machine cleanup).

Co-Authored-By: Claude Fable 5 <noreply@anthropic.com>
</commit_message>
<xml_diff>
--- a/Parth_Anand_Product_Designer_Resume.docx
+++ b/Parth_Anand_Product_Designer_Resume.docx
@@ -44,7 +44,7 @@
         </w:rPr>
         <w:t xml:space="preserve">Noida, India  |  +91 72096 84084  |  </w:t>
       </w:r>
-      <w:hyperlink w:history="1" r:id="rIdzsgrexykiilhlkbzdc6ap">
+      <w:hyperlink w:history="1" r:id="rId2dayyxazoawig9j1xwykj">
         <w:r>
           <w:rPr>
             <w:rStyle w:val="Hyperlink"/>
@@ -61,7 +61,7 @@
         </w:rPr>
         <w:t xml:space="preserve">  |  </w:t>
       </w:r>
-      <w:hyperlink w:history="1" r:id="rIdsmmuaqwqn4oxiwekhvyp1">
+      <w:hyperlink w:history="1" r:id="rIditmozclxtr2zlsw7odml4">
         <w:r>
           <w:rPr>
             <w:rStyle w:val="Hyperlink"/>
@@ -78,7 +78,7 @@
         </w:rPr>
         <w:t xml:space="preserve">  |  </w:t>
       </w:r>
-      <w:hyperlink w:history="1" r:id="rId6l4duonl_zxxg66mrsnfu">
+      <w:hyperlink w:history="1" r:id="rId26f8g-b2i5cb3hwn_sba4">
         <w:r>
           <w:rPr>
             <w:rStyle w:val="Hyperlink"/>
@@ -438,6 +438,49 @@
           <w:sz w:val="18"/>
           <w:szCs w:val="18"/>
         </w:rPr>
+        <w:t xml:space="preserve">Independent - Motion Designer (Freelance)</w:t>
+      </w:r>
+      <w:r>
+        <w:rPr>
+          <w:b/>
+          <w:bCs/>
+          <w:sz w:val="17"/>
+          <w:szCs w:val="17"/>
+        </w:rPr>
+        <w:t xml:space="preserve">	Feb 2022 - May 2022</w:t>
+      </w:r>
+    </w:p>
+    <w:p>
+      <w:pPr>
+        <w:pStyle w:val="ListParagraph"/>
+        <w:numPr>
+          <w:ilvl w:val="0"/>
+          <w:numId w:val="2"/>
+        </w:numPr>
+        <w:spacing w:after="15" w:line="262" w:lineRule="auto"/>
+      </w:pPr>
+      <w:r>
+        <w:rPr>
+          <w:sz w:val="18"/>
+          <w:szCs w:val="18"/>
+        </w:rPr>
+        <w:t xml:space="preserve">Delivered animation and motion-graphics packages for YouTube content creators on freelance client timelines.</w:t>
+      </w:r>
+    </w:p>
+    <w:p>
+      <w:pPr>
+        <w:tabs>
+          <w:tab w:val="right" w:pos="10800"/>
+        </w:tabs>
+        <w:spacing w:after="10" w:before="60"/>
+      </w:pPr>
+      <w:r>
+        <w:rPr>
+          <w:b/>
+          <w:bCs/>
+          <w:sz w:val="18"/>
+          <w:szCs w:val="18"/>
+        </w:rPr>
         <w:t xml:space="preserve">HMLC (Harsh Mann Luxury Consultancy) - Lead Designer, UI/UX &amp; Motion</w:t>
       </w:r>
       <w:r>
@@ -698,7 +741,10 @@
     </w:p>
     <w:p>
       <w:pPr>
-        <w:spacing w:after="8"/>
+        <w:tabs>
+          <w:tab w:val="right" w:pos="10800"/>
+        </w:tabs>
+        <w:spacing w:after="30"/>
       </w:pPr>
       <w:r>
         <w:rPr>
@@ -709,11 +755,6 @@
         </w:rPr>
         <w:t xml:space="preserve">B.Des. in Fashion Communication - National Institute of Fashion Technology (NIFT), New Delhi</w:t>
       </w:r>
-    </w:p>
-    <w:p>
-      <w:pPr>
-        <w:spacing w:after="40"/>
-      </w:pPr>
       <w:r>
         <w:rPr>
           <w:i/>
@@ -722,12 +763,15 @@
           <w:sz w:val="17"/>
           <w:szCs w:val="17"/>
         </w:rPr>
-        <w:t xml:space="preserve">2017 - 2021</w:t>
-      </w:r>
-    </w:p>
-    <w:p>
-      <w:pPr>
-        <w:spacing w:after="8"/>
+        <w:t xml:space="preserve">	2017 - 2021</w:t>
+      </w:r>
+    </w:p>
+    <w:p>
+      <w:pPr>
+        <w:tabs>
+          <w:tab w:val="right" w:pos="10800"/>
+        </w:tabs>
+        <w:spacing w:after="30"/>
       </w:pPr>
       <w:r>
         <w:rPr>
@@ -738,11 +782,6 @@
         </w:rPr>
         <w:t xml:space="preserve">Professional UX Design - University of Cambridge, Online (via Coursera)</w:t>
       </w:r>
-    </w:p>
-    <w:p>
-      <w:pPr>
-        <w:spacing w:after="40"/>
-      </w:pPr>
       <w:r>
         <w:rPr>
           <w:i/>
@@ -751,12 +790,15 @@
           <w:sz w:val="17"/>
           <w:szCs w:val="17"/>
         </w:rPr>
-        <w:t xml:space="preserve">Apr 2026</w:t>
-      </w:r>
-    </w:p>
-    <w:p>
-      <w:pPr>
-        <w:spacing w:after="8"/>
+        <w:t xml:space="preserve">	Apr 2026</w:t>
+      </w:r>
+    </w:p>
+    <w:p>
+      <w:pPr>
+        <w:tabs>
+          <w:tab w:val="right" w:pos="10800"/>
+        </w:tabs>
+        <w:spacing w:after="0"/>
       </w:pPr>
       <w:r>
         <w:rPr>
@@ -767,11 +809,6 @@
         </w:rPr>
         <w:t xml:space="preserve">Foundations of UX Design - Google, Online (via Coursera)</w:t>
       </w:r>
-    </w:p>
-    <w:p>
-      <w:pPr>
-        <w:spacing w:after="0"/>
-      </w:pPr>
       <w:r>
         <w:rPr>
           <w:i/>
@@ -780,7 +817,7 @@
           <w:sz w:val="17"/>
           <w:szCs w:val="17"/>
         </w:rPr>
-        <w:t xml:space="preserve">2021</w:t>
+        <w:t xml:space="preserve">	2021</w:t>
       </w:r>
     </w:p>
     <w:sectPr>

</xml_diff>

<commit_message>
Add papercade open-source project to resume
</commit_message>
<xml_diff>
--- a/Parth_Anand_Product_Designer_Resume.docx
+++ b/Parth_Anand_Product_Designer_Resume.docx
@@ -44,7 +44,7 @@
         </w:rPr>
         <w:t xml:space="preserve">Noida, India  |  +91 72096 84084  |  </w:t>
       </w:r>
-      <w:hyperlink w:history="1" r:id="rId2dayyxazoawig9j1xwykj">
+      <w:hyperlink w:history="1" r:id="rId61zv7w2dsyposysxkb1il">
         <w:r>
           <w:rPr>
             <w:rStyle w:val="Hyperlink"/>
@@ -61,7 +61,7 @@
         </w:rPr>
         <w:t xml:space="preserve">  |  </w:t>
       </w:r>
-      <w:hyperlink w:history="1" r:id="rIditmozclxtr2zlsw7odml4">
+      <w:hyperlink w:history="1" r:id="rIdakzyqrr24kowscqzm6hsb">
         <w:r>
           <w:rPr>
             <w:rStyle w:val="Hyperlink"/>
@@ -78,7 +78,7 @@
         </w:rPr>
         <w:t xml:space="preserve">  |  </w:t>
       </w:r>
-      <w:hyperlink w:history="1" r:id="rId26f8g-b2i5cb3hwn_sba4">
+      <w:hyperlink w:history="1" r:id="rIdw4xi25f7uldjmoantmedi">
         <w:r>
           <w:rPr>
             <w:rStyle w:val="Hyperlink"/>
@@ -94,7 +94,7 @@
         <w:pBdr>
           <w:bottom w:val="single" w:color="1A1A1A" w:sz="4" w:space="1"/>
         </w:pBdr>
-        <w:spacing w:after="40" w:before="80"/>
+        <w:spacing w:after="30" w:before="60"/>
       </w:pPr>
       <w:r>
         <w:rPr>
@@ -110,7 +110,7 @@
     </w:p>
     <w:p>
       <w:pPr>
-        <w:spacing w:after="60" w:line="262" w:lineRule="auto"/>
+        <w:spacing w:after="60" w:line="248" w:lineRule="auto"/>
       </w:pPr>
       <w:r>
         <w:rPr>
@@ -125,7 +125,7 @@
         <w:pBdr>
           <w:bottom w:val="single" w:color="1A1A1A" w:sz="4" w:space="1"/>
         </w:pBdr>
-        <w:spacing w:after="40" w:before="80"/>
+        <w:spacing w:after="30" w:before="60"/>
       </w:pPr>
       <w:r>
         <w:rPr>
@@ -158,7 +158,7 @@
         <w:pBdr>
           <w:bottom w:val="single" w:color="1A1A1A" w:sz="4" w:space="1"/>
         </w:pBdr>
-        <w:spacing w:after="40" w:before="80"/>
+        <w:spacing w:after="30" w:before="60"/>
       </w:pPr>
       <w:r>
         <w:rPr>
@@ -220,7 +220,7 @@
           <w:ilvl w:val="0"/>
           <w:numId w:val="2"/>
         </w:numPr>
-        <w:spacing w:after="15" w:line="262" w:lineRule="auto"/>
+        <w:spacing w:after="15" w:line="248" w:lineRule="auto"/>
       </w:pPr>
       <w:r>
         <w:rPr>
@@ -237,7 +237,7 @@
           <w:ilvl w:val="0"/>
           <w:numId w:val="2"/>
         </w:numPr>
-        <w:spacing w:after="15" w:line="262" w:lineRule="auto"/>
+        <w:spacing w:after="15" w:line="248" w:lineRule="auto"/>
       </w:pPr>
       <w:r>
         <w:rPr>
@@ -254,7 +254,7 @@
           <w:ilvl w:val="0"/>
           <w:numId w:val="2"/>
         </w:numPr>
-        <w:spacing w:after="15" w:line="262" w:lineRule="auto"/>
+        <w:spacing w:after="15" w:line="248" w:lineRule="auto"/>
       </w:pPr>
       <w:r>
         <w:rPr>
@@ -271,7 +271,7 @@
           <w:ilvl w:val="0"/>
           <w:numId w:val="2"/>
         </w:numPr>
-        <w:spacing w:after="15" w:line="262" w:lineRule="auto"/>
+        <w:spacing w:after="15" w:line="248" w:lineRule="auto"/>
       </w:pPr>
       <w:r>
         <w:rPr>
@@ -288,7 +288,7 @@
           <w:ilvl w:val="0"/>
           <w:numId w:val="2"/>
         </w:numPr>
-        <w:spacing w:after="15" w:line="262" w:lineRule="auto"/>
+        <w:spacing w:after="15" w:line="248" w:lineRule="auto"/>
       </w:pPr>
       <w:r>
         <w:rPr>
@@ -305,7 +305,7 @@
           <w:ilvl w:val="0"/>
           <w:numId w:val="2"/>
         </w:numPr>
-        <w:spacing w:after="15" w:line="262" w:lineRule="auto"/>
+        <w:spacing w:after="15" w:line="248" w:lineRule="auto"/>
       </w:pPr>
       <w:r>
         <w:rPr>
@@ -363,7 +363,7 @@
           <w:ilvl w:val="0"/>
           <w:numId w:val="2"/>
         </w:numPr>
-        <w:spacing w:after="15" w:line="262" w:lineRule="auto"/>
+        <w:spacing w:after="15" w:line="248" w:lineRule="auto"/>
       </w:pPr>
       <w:r>
         <w:rPr>
@@ -380,7 +380,7 @@
           <w:ilvl w:val="0"/>
           <w:numId w:val="2"/>
         </w:numPr>
-        <w:spacing w:after="15" w:line="262" w:lineRule="auto"/>
+        <w:spacing w:after="15" w:line="248" w:lineRule="auto"/>
       </w:pPr>
       <w:r>
         <w:rPr>
@@ -397,7 +397,7 @@
           <w:ilvl w:val="0"/>
           <w:numId w:val="2"/>
         </w:numPr>
-        <w:spacing w:after="15" w:line="262" w:lineRule="auto"/>
+        <w:spacing w:after="15" w:line="248" w:lineRule="auto"/>
       </w:pPr>
       <w:r>
         <w:rPr>
@@ -414,7 +414,7 @@
           <w:ilvl w:val="0"/>
           <w:numId w:val="2"/>
         </w:numPr>
-        <w:spacing w:after="15" w:line="262" w:lineRule="auto"/>
+        <w:spacing w:after="15" w:line="248" w:lineRule="auto"/>
       </w:pPr>
       <w:r>
         <w:rPr>
@@ -457,7 +457,7 @@
           <w:ilvl w:val="0"/>
           <w:numId w:val="2"/>
         </w:numPr>
-        <w:spacing w:after="15" w:line="262" w:lineRule="auto"/>
+        <w:spacing w:after="15" w:line="248" w:lineRule="auto"/>
       </w:pPr>
       <w:r>
         <w:rPr>
@@ -515,7 +515,7 @@
           <w:ilvl w:val="0"/>
           <w:numId w:val="2"/>
         </w:numPr>
-        <w:spacing w:after="15" w:line="262" w:lineRule="auto"/>
+        <w:spacing w:after="15" w:line="248" w:lineRule="auto"/>
       </w:pPr>
       <w:r>
         <w:rPr>
@@ -532,7 +532,7 @@
           <w:ilvl w:val="0"/>
           <w:numId w:val="2"/>
         </w:numPr>
-        <w:spacing w:after="15" w:line="262" w:lineRule="auto"/>
+        <w:spacing w:after="15" w:line="248" w:lineRule="auto"/>
       </w:pPr>
       <w:r>
         <w:rPr>
@@ -590,7 +590,7 @@
           <w:ilvl w:val="0"/>
           <w:numId w:val="2"/>
         </w:numPr>
-        <w:spacing w:after="15" w:line="262" w:lineRule="auto"/>
+        <w:spacing w:after="15" w:line="248" w:lineRule="auto"/>
       </w:pPr>
       <w:r>
         <w:rPr>
@@ -607,7 +607,7 @@
           <w:ilvl w:val="0"/>
           <w:numId w:val="2"/>
         </w:numPr>
-        <w:spacing w:after="15" w:line="262" w:lineRule="auto"/>
+        <w:spacing w:after="15" w:line="248" w:lineRule="auto"/>
       </w:pPr>
       <w:r>
         <w:rPr>
@@ -622,7 +622,7 @@
         <w:pBdr>
           <w:bottom w:val="single" w:color="1A1A1A" w:sz="4" w:space="1"/>
         </w:pBdr>
-        <w:spacing w:after="40" w:before="80"/>
+        <w:spacing w:after="30" w:before="60"/>
       </w:pPr>
       <w:r>
         <w:rPr>
@@ -638,7 +638,7 @@
     </w:p>
     <w:p>
       <w:pPr>
-        <w:spacing w:after="40" w:line="262" w:lineRule="auto"/>
+        <w:spacing w:after="40" w:line="248" w:lineRule="auto"/>
       </w:pPr>
       <w:r>
         <w:rPr>
@@ -659,7 +659,7 @@
     </w:p>
     <w:p>
       <w:pPr>
-        <w:spacing w:after="40" w:line="262" w:lineRule="auto"/>
+        <w:spacing w:after="40" w:line="248" w:lineRule="auto"/>
       </w:pPr>
       <w:r>
         <w:rPr>
@@ -680,7 +680,7 @@
     </w:p>
     <w:p>
       <w:pPr>
-        <w:spacing w:after="40" w:line="262" w:lineRule="auto"/>
+        <w:spacing w:after="40" w:line="248" w:lineRule="auto"/>
       </w:pPr>
       <w:r>
         <w:rPr>
@@ -701,7 +701,7 @@
     </w:p>
     <w:p>
       <w:pPr>
-        <w:spacing w:after="0" w:line="262" w:lineRule="auto"/>
+        <w:spacing w:after="40" w:line="248" w:lineRule="auto"/>
       </w:pPr>
       <w:r>
         <w:rPr>
@@ -718,6 +718,27 @@
           <w:szCs w:val="18"/>
         </w:rPr>
         <w:t xml:space="preserve">Framer, Lottie, Adobe Creative Suite, Miro, Hotjar, Amplitude, ProtoPie, Dovetail; AI-directed prototyping, asset production, and research synthesis (Claude, Midjourney)</w:t>
+      </w:r>
+    </w:p>
+    <w:p>
+      <w:pPr>
+        <w:spacing w:after="0" w:line="248" w:lineRule="auto"/>
+      </w:pPr>
+      <w:r>
+        <w:rPr>
+          <w:b/>
+          <w:bCs/>
+          <w:sz w:val="18"/>
+          <w:szCs w:val="18"/>
+        </w:rPr>
+        <w:t xml:space="preserve">Personal Project: </w:t>
+      </w:r>
+      <w:r>
+        <w:rPr>
+          <w:sz w:val="18"/>
+          <w:szCs w:val="18"/>
+        </w:rPr>
+        <w:t xml:space="preserve">papercade - solo-built open-source UI library (12 components, pixel x sketch aesthetic), published to npm with a live demo; strict TypeScript, CI/CD - github.com/anandparth/papercade</w:t>
       </w:r>
     </w:p>
     <w:p>
@@ -725,7 +746,7 @@
         <w:pBdr>
           <w:bottom w:val="single" w:color="1A1A1A" w:sz="4" w:space="1"/>
         </w:pBdr>
-        <w:spacing w:after="40" w:before="80"/>
+        <w:spacing w:after="30" w:before="60"/>
       </w:pPr>
       <w:r>
         <w:rPr>

</xml_diff>

<commit_message>
Expand Independent freelance bullet with After Effects, Lottie, AR/VR detail
</commit_message>
<xml_diff>
--- a/Parth_Anand_Product_Designer_Resume.docx
+++ b/Parth_Anand_Product_Designer_Resume.docx
@@ -44,7 +44,7 @@
         </w:rPr>
         <w:t xml:space="preserve">Noida, India  |  +91 72096 84084  |  </w:t>
       </w:r>
-      <w:hyperlink w:history="1" r:id="rId61zv7w2dsyposysxkb1il">
+      <w:hyperlink w:history="1" r:id="rIddyxtpdy-5wlm8xfyp0ft7">
         <w:r>
           <w:rPr>
             <w:rStyle w:val="Hyperlink"/>
@@ -61,7 +61,7 @@
         </w:rPr>
         <w:t xml:space="preserve">  |  </w:t>
       </w:r>
-      <w:hyperlink w:history="1" r:id="rIdakzyqrr24kowscqzm6hsb">
+      <w:hyperlink w:history="1" r:id="rIdmsn0qd8t6iafqdsehsj8u">
         <w:r>
           <w:rPr>
             <w:rStyle w:val="Hyperlink"/>
@@ -78,7 +78,7 @@
         </w:rPr>
         <w:t xml:space="preserve">  |  </w:t>
       </w:r>
-      <w:hyperlink w:history="1" r:id="rIdw4xi25f7uldjmoantmedi">
+      <w:hyperlink w:history="1" r:id="rIdscp4f6ufshxozw9ohn-dj">
         <w:r>
           <w:rPr>
             <w:rStyle w:val="Hyperlink"/>
@@ -464,7 +464,7 @@
           <w:sz w:val="18"/>
           <w:szCs w:val="18"/>
         </w:rPr>
-        <w:t xml:space="preserve">Delivered animation and motion-graphics packages for YouTube content creators on freelance client timelines.</w:t>
+        <w:t xml:space="preserve">Delivered end-to-end animation and motion-graphics packages for YouTube creators on freelance timelines, deepening expertise in After Effects and Lottie while applying motion design to scalable UI experiences and prototyping 3D interactions with Meta AR/VR technology.</w:t>
       </w:r>
     </w:p>
     <w:p>

</xml_diff>

<commit_message>
Add leadership signal, papercade weight, and CoinDCX bullet fixes
Mentored-designer and cross-functional-leadership bullets added to InfoEdge/HMLC, InfoEdge fraud bullets merged for balance, Canon trimmed to its strongest line, papercade line expanded with MIT license and CI/CD detail, CoinDCX Figma bullet reworked to stand on its own, Okto casing corrected
</commit_message>
<xml_diff>
--- a/Parth_Anand_Product_Designer_Resume.docx
+++ b/Parth_Anand_Product_Designer_Resume.docx
@@ -44,7 +44,7 @@
         </w:rPr>
         <w:t xml:space="preserve">Noida, India  |  +91 72096 84084  |  </w:t>
       </w:r>
-      <w:hyperlink w:history="1" r:id="rIddyxtpdy-5wlm8xfyp0ft7">
+      <w:hyperlink w:history="1" r:id="rIdwhlts3do3ohtsnzl1glxr">
         <w:r>
           <w:rPr>
             <w:rStyle w:val="Hyperlink"/>
@@ -61,7 +61,7 @@
         </w:rPr>
         <w:t xml:space="preserve">  |  </w:t>
       </w:r>
-      <w:hyperlink w:history="1" r:id="rIdmsn0qd8t6iafqdsehsj8u">
+      <w:hyperlink w:history="1" r:id="rId2bbxmkewkyovy1bwpq8s_">
         <w:r>
           <w:rPr>
             <w:rStyle w:val="Hyperlink"/>
@@ -78,7 +78,7 @@
         </w:rPr>
         <w:t xml:space="preserve">  |  </w:t>
       </w:r>
-      <w:hyperlink w:history="1" r:id="rIdscp4f6ufshxozw9ohn-dj">
+      <w:hyperlink w:history="1" r:id="rIdnb7swak_oy9s8a95qoib3">
         <w:r>
           <w:rPr>
             <w:rStyle w:val="Hyperlink"/>
@@ -94,7 +94,7 @@
         <w:pBdr>
           <w:bottom w:val="single" w:color="1A1A1A" w:sz="4" w:space="1"/>
         </w:pBdr>
-        <w:spacing w:after="30" w:before="60"/>
+        <w:spacing w:after="26" w:before="52"/>
       </w:pPr>
       <w:r>
         <w:rPr>
@@ -110,7 +110,7 @@
     </w:p>
     <w:p>
       <w:pPr>
-        <w:spacing w:after="60" w:line="248" w:lineRule="auto"/>
+        <w:spacing w:after="60" w:line="242" w:lineRule="auto"/>
       </w:pPr>
       <w:r>
         <w:rPr>
@@ -125,7 +125,7 @@
         <w:pBdr>
           <w:bottom w:val="single" w:color="1A1A1A" w:sz="4" w:space="1"/>
         </w:pBdr>
-        <w:spacing w:after="30" w:before="60"/>
+        <w:spacing w:after="26" w:before="52"/>
       </w:pPr>
       <w:r>
         <w:rPr>
@@ -158,7 +158,7 @@
         <w:pBdr>
           <w:bottom w:val="single" w:color="1A1A1A" w:sz="4" w:space="1"/>
         </w:pBdr>
-        <w:spacing w:after="30" w:before="60"/>
+        <w:spacing w:after="26" w:before="52"/>
       </w:pPr>
       <w:r>
         <w:rPr>
@@ -177,7 +177,7 @@
         <w:tabs>
           <w:tab w:val="right" w:pos="10800"/>
         </w:tabs>
-        <w:spacing w:after="10" w:before="60"/>
+        <w:spacing w:after="9" w:before="52"/>
       </w:pPr>
       <w:r>
         <w:rPr>
@@ -200,7 +200,7 @@
     </w:p>
     <w:p>
       <w:pPr>
-        <w:spacing w:after="30"/>
+        <w:spacing w:after="26"/>
       </w:pPr>
       <w:r>
         <w:rPr>
@@ -220,7 +220,7 @@
           <w:ilvl w:val="0"/>
           <w:numId w:val="2"/>
         </w:numPr>
-        <w:spacing w:after="15" w:line="248" w:lineRule="auto"/>
+        <w:spacing w:after="13" w:line="242" w:lineRule="auto"/>
       </w:pPr>
       <w:r>
         <w:rPr>
@@ -237,7 +237,7 @@
           <w:ilvl w:val="0"/>
           <w:numId w:val="2"/>
         </w:numPr>
-        <w:spacing w:after="15" w:line="248" w:lineRule="auto"/>
+        <w:spacing w:after="13" w:line="242" w:lineRule="auto"/>
       </w:pPr>
       <w:r>
         <w:rPr>
@@ -254,41 +254,41 @@
           <w:ilvl w:val="0"/>
           <w:numId w:val="2"/>
         </w:numPr>
-        <w:spacing w:after="15" w:line="248" w:lineRule="auto"/>
-      </w:pPr>
-      <w:r>
-        <w:rPr>
-          <w:sz w:val="18"/>
-          <w:szCs w:val="18"/>
-        </w:rPr>
-        <w:t xml:space="preserve">Led a fraud-prevention initiative end to end: mapped 249 blacklisted recruiters and 653 fake listings across Delhi NCR, identifying Security Guard as the highest-risk job segment.</w:t>
-      </w:r>
-    </w:p>
-    <w:p>
-      <w:pPr>
-        <w:pStyle w:val="ListParagraph"/>
-        <w:numPr>
-          <w:ilvl w:val="0"/>
-          <w:numId w:val="2"/>
-        </w:numPr>
-        <w:spacing w:after="15" w:line="248" w:lineRule="auto"/>
-      </w:pPr>
-      <w:r>
-        <w:rPr>
-          <w:sz w:val="18"/>
-          <w:szCs w:val="18"/>
-        </w:rPr>
-        <w:t xml:space="preserve">Modeled and presented a roadmap of 6 prioritized recommendations to senior stakeholders, projecting a 68% fraud reduction and a +22-point NPS lift; approved for implementation.</w:t>
-      </w:r>
-    </w:p>
-    <w:p>
-      <w:pPr>
-        <w:pStyle w:val="ListParagraph"/>
-        <w:numPr>
-          <w:ilvl w:val="0"/>
-          <w:numId w:val="2"/>
-        </w:numPr>
-        <w:spacing w:after="15" w:line="248" w:lineRule="auto"/>
+        <w:spacing w:after="13" w:line="242" w:lineRule="auto"/>
+      </w:pPr>
+      <w:r>
+        <w:rPr>
+          <w:sz w:val="18"/>
+          <w:szCs w:val="18"/>
+        </w:rPr>
+        <w:t xml:space="preserve">Mentored a junior designer on the Job Hai team, reviewing interaction-design work and onboarding them onto the team's Figma design system and workflow.</w:t>
+      </w:r>
+    </w:p>
+    <w:p>
+      <w:pPr>
+        <w:pStyle w:val="ListParagraph"/>
+        <w:numPr>
+          <w:ilvl w:val="0"/>
+          <w:numId w:val="2"/>
+        </w:numPr>
+        <w:spacing w:after="13" w:line="242" w:lineRule="auto"/>
+      </w:pPr>
+      <w:r>
+        <w:rPr>
+          <w:sz w:val="18"/>
+          <w:szCs w:val="18"/>
+        </w:rPr>
+        <w:t xml:space="preserve">Led a fraud-prevention initiative end to end: mapped 249 blacklisted recruiters and 653 fake listings across Delhi NCR, then modeled and presented a roadmap of 6 prioritized recommendations to senior stakeholders, projecting a 68% fraud reduction and a +22-point NPS lift; approved for implementation.</w:t>
+      </w:r>
+    </w:p>
+    <w:p>
+      <w:pPr>
+        <w:pStyle w:val="ListParagraph"/>
+        <w:numPr>
+          <w:ilvl w:val="0"/>
+          <w:numId w:val="2"/>
+        </w:numPr>
+        <w:spacing w:after="13" w:line="242" w:lineRule="auto"/>
       </w:pPr>
       <w:r>
         <w:rPr>
@@ -305,7 +305,7 @@
           <w:ilvl w:val="0"/>
           <w:numId w:val="2"/>
         </w:numPr>
-        <w:spacing w:after="15" w:line="248" w:lineRule="auto"/>
+        <w:spacing w:after="13" w:line="242" w:lineRule="auto"/>
       </w:pPr>
       <w:r>
         <w:rPr>
@@ -320,7 +320,7 @@
         <w:tabs>
           <w:tab w:val="right" w:pos="10800"/>
         </w:tabs>
-        <w:spacing w:after="10" w:before="60"/>
+        <w:spacing w:after="9" w:before="52"/>
       </w:pPr>
       <w:r>
         <w:rPr>
@@ -343,7 +343,7 @@
     </w:p>
     <w:p>
       <w:pPr>
-        <w:spacing w:after="30"/>
+        <w:spacing w:after="26"/>
       </w:pPr>
       <w:r>
         <w:rPr>
@@ -353,17 +353,17 @@
           <w:sz w:val="16"/>
           <w:szCs w:val="16"/>
         </w:rPr>
-        <w:t xml:space="preserve">OKTO | Self-custody Web3 DeFi wallet | 1M+ users | iOS &amp; Android</w:t>
-      </w:r>
-    </w:p>
-    <w:p>
-      <w:pPr>
-        <w:pStyle w:val="ListParagraph"/>
-        <w:numPr>
-          <w:ilvl w:val="0"/>
-          <w:numId w:val="2"/>
-        </w:numPr>
-        <w:spacing w:after="15" w:line="248" w:lineRule="auto"/>
+        <w:t xml:space="preserve">Okto | Self-custody Web3 DeFi wallet | 1M+ users | iOS &amp; Android</w:t>
+      </w:r>
+    </w:p>
+    <w:p>
+      <w:pPr>
+        <w:pStyle w:val="ListParagraph"/>
+        <w:numPr>
+          <w:ilvl w:val="0"/>
+          <w:numId w:val="2"/>
+        </w:numPr>
+        <w:spacing w:after="13" w:line="242" w:lineRule="auto"/>
       </w:pPr>
       <w:r>
         <w:rPr>
@@ -380,41 +380,41 @@
           <w:ilvl w:val="0"/>
           <w:numId w:val="2"/>
         </w:numPr>
-        <w:spacing w:after="15" w:line="248" w:lineRule="auto"/>
-      </w:pPr>
-      <w:r>
-        <w:rPr>
-          <w:sz w:val="18"/>
-          <w:szCs w:val="18"/>
-        </w:rPr>
-        <w:t xml:space="preserve">Owned research-to-UI for OKTO's first-time user onboarding, a core surface of a self-custody wallet serving 1M+ users across iOS and Android.</w:t>
-      </w:r>
-    </w:p>
-    <w:p>
-      <w:pPr>
-        <w:pStyle w:val="ListParagraph"/>
-        <w:numPr>
-          <w:ilvl w:val="0"/>
-          <w:numId w:val="2"/>
-        </w:numPr>
-        <w:spacing w:after="15" w:line="248" w:lineRule="auto"/>
-      </w:pPr>
-      <w:r>
-        <w:rPr>
-          <w:sz w:val="18"/>
-          <w:szCs w:val="18"/>
-        </w:rPr>
-        <w:t xml:space="preserve">Built a Figma component library with design tokens for systemic UI consistency.</w:t>
-      </w:r>
-    </w:p>
-    <w:p>
-      <w:pPr>
-        <w:pStyle w:val="ListParagraph"/>
-        <w:numPr>
-          <w:ilvl w:val="0"/>
-          <w:numId w:val="2"/>
-        </w:numPr>
-        <w:spacing w:after="15" w:line="248" w:lineRule="auto"/>
+        <w:spacing w:after="13" w:line="242" w:lineRule="auto"/>
+      </w:pPr>
+      <w:r>
+        <w:rPr>
+          <w:sz w:val="18"/>
+          <w:szCs w:val="18"/>
+        </w:rPr>
+        <w:t xml:space="preserve">Owned research-to-UI for Okto's first-time user onboarding, a core surface of a self-custody wallet serving 1M+ users across iOS and Android.</w:t>
+      </w:r>
+    </w:p>
+    <w:p>
+      <w:pPr>
+        <w:pStyle w:val="ListParagraph"/>
+        <w:numPr>
+          <w:ilvl w:val="0"/>
+          <w:numId w:val="2"/>
+        </w:numPr>
+        <w:spacing w:after="13" w:line="242" w:lineRule="auto"/>
+      </w:pPr>
+      <w:r>
+        <w:rPr>
+          <w:sz w:val="18"/>
+          <w:szCs w:val="18"/>
+        </w:rPr>
+        <w:t xml:space="preserve">Established a cross-platform Figma component library with design tokens to keep Okto's iOS and Android UI consistent as new flows shipped.</w:t>
+      </w:r>
+    </w:p>
+    <w:p>
+      <w:pPr>
+        <w:pStyle w:val="ListParagraph"/>
+        <w:numPr>
+          <w:ilvl w:val="0"/>
+          <w:numId w:val="2"/>
+        </w:numPr>
+        <w:spacing w:after="13" w:line="242" w:lineRule="auto"/>
       </w:pPr>
       <w:r>
         <w:rPr>
@@ -429,7 +429,7 @@
         <w:tabs>
           <w:tab w:val="right" w:pos="10800"/>
         </w:tabs>
-        <w:spacing w:after="10" w:before="60"/>
+        <w:spacing w:after="9" w:before="52"/>
       </w:pPr>
       <w:r>
         <w:rPr>
@@ -457,7 +457,7 @@
           <w:ilvl w:val="0"/>
           <w:numId w:val="2"/>
         </w:numPr>
-        <w:spacing w:after="15" w:line="248" w:lineRule="auto"/>
+        <w:spacing w:after="13" w:line="242" w:lineRule="auto"/>
       </w:pPr>
       <w:r>
         <w:rPr>
@@ -472,7 +472,7 @@
         <w:tabs>
           <w:tab w:val="right" w:pos="10800"/>
         </w:tabs>
-        <w:spacing w:after="10" w:before="60"/>
+        <w:spacing w:after="9" w:before="52"/>
       </w:pPr>
       <w:r>
         <w:rPr>
@@ -495,7 +495,7 @@
     </w:p>
     <w:p>
       <w:pPr>
-        <w:spacing w:after="30"/>
+        <w:spacing w:after="26"/>
       </w:pPr>
       <w:r>
         <w:rPr>
@@ -515,7 +515,7 @@
           <w:ilvl w:val="0"/>
           <w:numId w:val="2"/>
         </w:numPr>
-        <w:spacing w:after="15" w:line="248" w:lineRule="auto"/>
+        <w:spacing w:after="13" w:line="242" w:lineRule="auto"/>
       </w:pPr>
       <w:r>
         <w:rPr>
@@ -532,14 +532,31 @@
           <w:ilvl w:val="0"/>
           <w:numId w:val="2"/>
         </w:numPr>
-        <w:spacing w:after="15" w:line="248" w:lineRule="auto"/>
-      </w:pPr>
-      <w:r>
-        <w:rPr>
-          <w:sz w:val="18"/>
-          <w:szCs w:val="18"/>
-        </w:rPr>
-        <w:t xml:space="preserve">Drove an 18-22% uplift in page conversion rate across tested variants for boutique retail clients.</w:t>
+        <w:spacing w:after="13" w:line="242" w:lineRule="auto"/>
+      </w:pPr>
+      <w:r>
+        <w:rPr>
+          <w:sz w:val="18"/>
+          <w:szCs w:val="18"/>
+        </w:rPr>
+        <w:t xml:space="preserve">Achieved as much as a 22% increase in page conversion rate across tested variants.</w:t>
+      </w:r>
+    </w:p>
+    <w:p>
+      <w:pPr>
+        <w:pStyle w:val="ListParagraph"/>
+        <w:numPr>
+          <w:ilvl w:val="0"/>
+          <w:numId w:val="2"/>
+        </w:numPr>
+        <w:spacing w:after="13" w:line="242" w:lineRule="auto"/>
+      </w:pPr>
+      <w:r>
+        <w:rPr>
+          <w:sz w:val="18"/>
+          <w:szCs w:val="18"/>
+        </w:rPr>
+        <w:t xml:space="preserve">Owned the client-facing review process and developer handoff across those engagements - the primary point of contact translating client decisions into shippable specs for engineering.</w:t>
       </w:r>
     </w:p>
     <w:p>
@@ -547,7 +564,7 @@
         <w:tabs>
           <w:tab w:val="right" w:pos="10800"/>
         </w:tabs>
-        <w:spacing w:after="10" w:before="60"/>
+        <w:spacing w:after="9" w:before="52"/>
       </w:pPr>
       <w:r>
         <w:rPr>
@@ -570,7 +587,7 @@
     </w:p>
     <w:p>
       <w:pPr>
-        <w:spacing w:after="30"/>
+        <w:spacing w:after="26"/>
       </w:pPr>
       <w:r>
         <w:rPr>
@@ -580,41 +597,24 @@
           <w:sz w:val="16"/>
           <w:szCs w:val="16"/>
         </w:rPr>
-        <w:t xml:space="preserve">Apprenticeship under Ravi Dhingra Label | Consumer camera redesign</w:t>
-      </w:r>
-    </w:p>
-    <w:p>
-      <w:pPr>
-        <w:pStyle w:val="ListParagraph"/>
-        <w:numPr>
-          <w:ilvl w:val="0"/>
-          <w:numId w:val="2"/>
-        </w:numPr>
-        <w:spacing w:after="15" w:line="248" w:lineRule="auto"/>
-      </w:pPr>
-      <w:r>
-        <w:rPr>
-          <w:sz w:val="18"/>
-          <w:szCs w:val="18"/>
-        </w:rPr>
-        <w:t xml:space="preserve">Conceptually redesigned Canon India's camera shopping experience, simplifying discovery, comparison, and purchase journeys across 5+ campaign pages.</w:t>
-      </w:r>
-    </w:p>
-    <w:p>
-      <w:pPr>
-        <w:pStyle w:val="ListParagraph"/>
-        <w:numPr>
-          <w:ilvl w:val="0"/>
-          <w:numId w:val="2"/>
-        </w:numPr>
-        <w:spacing w:after="15" w:line="248" w:lineRule="auto"/>
-      </w:pPr>
-      <w:r>
-        <w:rPr>
-          <w:sz w:val="18"/>
-          <w:szCs w:val="18"/>
-        </w:rPr>
-        <w:t xml:space="preserve">Delivered high-fidelity mockups and annotated prototypes for developer handoff.</w:t>
+        <w:t xml:space="preserve">Consumer camera redesign (concept project)</w:t>
+      </w:r>
+    </w:p>
+    <w:p>
+      <w:pPr>
+        <w:pStyle w:val="ListParagraph"/>
+        <w:numPr>
+          <w:ilvl w:val="0"/>
+          <w:numId w:val="2"/>
+        </w:numPr>
+        <w:spacing w:after="13" w:line="242" w:lineRule="auto"/>
+      </w:pPr>
+      <w:r>
+        <w:rPr>
+          <w:sz w:val="18"/>
+          <w:szCs w:val="18"/>
+        </w:rPr>
+        <w:t xml:space="preserve">Redesigned Canon India's camera shopping experience, simplifying discovery, comparison, and purchase journeys across 5+ campaign pages.</w:t>
       </w:r>
     </w:p>
     <w:p>
@@ -622,7 +622,7 @@
         <w:pBdr>
           <w:bottom w:val="single" w:color="1A1A1A" w:sz="4" w:space="1"/>
         </w:pBdr>
-        <w:spacing w:after="30" w:before="60"/>
+        <w:spacing w:after="26" w:before="52"/>
       </w:pPr>
       <w:r>
         <w:rPr>
@@ -638,7 +638,7 @@
     </w:p>
     <w:p>
       <w:pPr>
-        <w:spacing w:after="40" w:line="248" w:lineRule="auto"/>
+        <w:spacing w:after="36" w:line="242" w:lineRule="auto"/>
       </w:pPr>
       <w:r>
         <w:rPr>
@@ -659,7 +659,7 @@
     </w:p>
     <w:p>
       <w:pPr>
-        <w:spacing w:after="40" w:line="248" w:lineRule="auto"/>
+        <w:spacing w:after="36" w:line="242" w:lineRule="auto"/>
       </w:pPr>
       <w:r>
         <w:rPr>
@@ -680,7 +680,7 @@
     </w:p>
     <w:p>
       <w:pPr>
-        <w:spacing w:after="40" w:line="248" w:lineRule="auto"/>
+        <w:spacing w:after="36" w:line="242" w:lineRule="auto"/>
       </w:pPr>
       <w:r>
         <w:rPr>
@@ -701,7 +701,7 @@
     </w:p>
     <w:p>
       <w:pPr>
-        <w:spacing w:after="40" w:line="248" w:lineRule="auto"/>
+        <w:spacing w:after="36" w:line="242" w:lineRule="auto"/>
       </w:pPr>
       <w:r>
         <w:rPr>
@@ -722,7 +722,7 @@
     </w:p>
     <w:p>
       <w:pPr>
-        <w:spacing w:after="0" w:line="248" w:lineRule="auto"/>
+        <w:spacing w:after="0" w:line="242" w:lineRule="auto"/>
       </w:pPr>
       <w:r>
         <w:rPr>
@@ -738,7 +738,7 @@
           <w:sz w:val="18"/>
           <w:szCs w:val="18"/>
         </w:rPr>
-        <w:t xml:space="preserve">papercade - solo-built open-source UI library (12 components, pixel x sketch aesthetic), published to npm with a live demo; strict TypeScript, CI/CD - github.com/anandparth/papercade</w:t>
+        <w:t xml:space="preserve">papercade - solo-built, MIT-licensed open-source UI library (12 components, pixel x sketch aesthetic); strict TypeScript, automated CI/CD (typecheck, tests, auto-deploy), published to npm with a live demo - github.com/anandparth/papercade</w:t>
       </w:r>
     </w:p>
     <w:p>
@@ -746,7 +746,7 @@
         <w:pBdr>
           <w:bottom w:val="single" w:color="1A1A1A" w:sz="4" w:space="1"/>
         </w:pBdr>
-        <w:spacing w:after="30" w:before="60"/>
+        <w:spacing w:after="26" w:before="52"/>
       </w:pPr>
       <w:r>
         <w:rPr>

</xml_diff>